<commit_message>
Worked on multiple merge functions.
</commit_message>
<xml_diff>
--- a/project/documents/letters/FFPayFees.docx
+++ b/project/documents/letters/FFPayFees.docx
@@ -4,260 +4,104 @@
   <w:body>
     <w:p>
       <w:pPr>
-        <w:pStyle w:val="Header"/>
-        <w:rPr>
-          <w:rFonts w:ascii="Times New Roman" w:hAnsi="Times New Roman"/>
+        <w:pStyle w:val="NormalWeb"/>
+        <w:spacing w:before="0" w:beforeAutospacing="0" w:after="0" w:afterAutospacing="0"/>
+      </w:pPr>
+      <w:r>
+        <w:t xml:space="preserve">Subject line: </w:t>
+      </w:r>
+      <w:r>
+        <w:t>Your Ref: &lt;&lt;faclientRefNo&gt;&gt;</w:t>
+      </w:r>
+      <w:r>
+        <w:rPr>
           <w:b/>
-          <w:sz w:val="20"/>
-          <w:szCs w:val="20"/>
-        </w:rPr>
-      </w:pPr>
-      <w:r>
-        <w:rPr>
-          <w:rFonts w:ascii="Times New Roman" w:hAnsi="Times New Roman"/>
-          <w:b/>
-          <w:sz w:val="20"/>
-          <w:szCs w:val="20"/>
-        </w:rPr>
-        <w:t>&lt;&lt;WAName&gt;&gt;  &lt;&lt;WAPhone&gt;&gt;</w:t>
-      </w:r>
-      <w:r>
-        <w:rPr>
-          <w:rFonts w:ascii="Times New Roman" w:hAnsi="Times New Roman"/>
-          <w:b/>
-          <w:sz w:val="20"/>
-          <w:szCs w:val="20"/>
-        </w:rPr>
-        <w:tab/>
-      </w:r>
-      <w:r>
-        <w:rPr>
-          <w:rFonts w:ascii="Times New Roman" w:hAnsi="Times New Roman"/>
-          <w:b/>
-          <w:sz w:val="20"/>
-          <w:szCs w:val="20"/>
-        </w:rPr>
-        <w:tab/>
-        <w:t>&lt;&lt;paraName&gt;&gt;  &lt;&lt;paraPhone&gt;&gt;</w:t>
-      </w:r>
-    </w:p>
-    <w:p>
-      <w:pPr>
-        <w:pStyle w:val="Header"/>
-        <w:rPr>
-          <w:rFonts w:ascii="Times New Roman" w:hAnsi="Times New Roman"/>
-          <w:b/>
-          <w:sz w:val="20"/>
-          <w:szCs w:val="20"/>
-        </w:rPr>
-      </w:pPr>
-      <w:r>
-        <w:rPr>
-          <w:rFonts w:ascii="Times New Roman" w:hAnsi="Times New Roman"/>
-          <w:b/>
-          <w:sz w:val="20"/>
-          <w:szCs w:val="20"/>
-        </w:rPr>
-        <w:t>&lt;&lt;WAEmail&gt;&gt;</w:t>
-      </w:r>
-      <w:r>
-        <w:rPr>
-          <w:rFonts w:ascii="Times New Roman" w:hAnsi="Times New Roman"/>
-          <w:b/>
-          <w:sz w:val="20"/>
-          <w:szCs w:val="20"/>
-        </w:rPr>
-        <w:tab/>
-      </w:r>
-      <w:r>
-        <w:rPr>
-          <w:rFonts w:ascii="Times New Roman" w:hAnsi="Times New Roman"/>
-          <w:b/>
-          <w:sz w:val="20"/>
-          <w:szCs w:val="20"/>
-        </w:rPr>
-        <w:tab/>
-        <w:t>&lt;&lt;paraEmail&gt;&gt;</w:t>
-      </w:r>
-    </w:p>
-    <w:p>
-      <w:pPr>
-        <w:rPr>
-          <w:rFonts w:ascii="Times New Roman" w:hAnsi="Times New Roman"/>
-          <w:sz w:val="24"/>
-          <w:szCs w:val="24"/>
-        </w:rPr>
-      </w:pPr>
-    </w:p>
-    <w:p>
-      <w:pPr>
-        <w:widowControl w:val="0"/>
-        <w:autoSpaceDE w:val="0"/>
-        <w:autoSpaceDN w:val="0"/>
-        <w:adjustRightInd w:val="0"/>
-        <w:jc w:val="both"/>
-        <w:rPr>
-          <w:rFonts w:ascii="Times New Roman" w:eastAsia="Times New Roman" w:hAnsi="Times New Roman"/>
-          <w:sz w:val="24"/>
-          <w:szCs w:val="24"/>
-        </w:rPr>
-      </w:pPr>
-      <w:r>
-        <w:rPr>
-          <w:rFonts w:ascii="Times New Roman" w:eastAsia="Times New Roman" w:hAnsi="Times New Roman"/>
-          <w:sz w:val="24"/>
-          <w:szCs w:val="24"/>
-        </w:rPr>
-        <w:t>&lt;&lt;currentDate&gt;&gt;</w:t>
-      </w:r>
-    </w:p>
-    <w:p>
-      <w:pPr>
-        <w:widowControl w:val="0"/>
-        <w:autoSpaceDE w:val="0"/>
-        <w:autoSpaceDN w:val="0"/>
-        <w:adjustRightInd w:val="0"/>
-        <w:jc w:val="both"/>
-        <w:rPr>
-          <w:rFonts w:ascii="Times New Roman" w:eastAsia="Times New Roman" w:hAnsi="Times New Roman"/>
-          <w:sz w:val="24"/>
-          <w:szCs w:val="24"/>
-        </w:rPr>
-      </w:pPr>
-    </w:p>
-    <w:tbl>
-      <w:tblPr>
-        <w:tblW w:w="9648" w:type="dxa"/>
-        <w:tblLook w:val="0000" w:firstRow="0" w:lastRow="0" w:firstColumn="0" w:lastColumn="0" w:noHBand="0" w:noVBand="0"/>
-      </w:tblPr>
-      <w:tblGrid>
-        <w:gridCol w:w="4068"/>
-        <w:gridCol w:w="5580"/>
-      </w:tblGrid>
-      <w:tr>
-        <w:tc>
-          <w:tcPr>
-            <w:tcW w:w="4068" w:type="dxa"/>
-          </w:tcPr>
-          <w:p>
-            <w:pPr>
-              <w:widowControl w:val="0"/>
-              <w:autoSpaceDE w:val="0"/>
-              <w:autoSpaceDN w:val="0"/>
-              <w:adjustRightInd w:val="0"/>
-              <w:rPr>
-                <w:rFonts w:ascii="Times New Roman" w:eastAsia="Times New Roman" w:hAnsi="Times New Roman"/>
-                <w:sz w:val="24"/>
-                <w:szCs w:val="24"/>
-              </w:rPr>
-            </w:pPr>
-            <w:r>
-              <w:rPr>
-                <w:rFonts w:ascii="Times New Roman" w:eastAsia="Times New Roman" w:hAnsi="Times New Roman"/>
-                <w:sz w:val="24"/>
-                <w:szCs w:val="24"/>
-              </w:rPr>
-              <w:t>&lt;&lt;faRecipient&gt;&gt;</w:t>
-            </w:r>
-          </w:p>
-          <w:p>
-            <w:pPr>
-              <w:widowControl w:val="0"/>
-              <w:autoSpaceDE w:val="0"/>
-              <w:autoSpaceDN w:val="0"/>
-              <w:adjustRightInd w:val="0"/>
-              <w:rPr>
-                <w:rFonts w:ascii="Times New Roman" w:eastAsia="Times New Roman" w:hAnsi="Times New Roman"/>
-                <w:sz w:val="24"/>
-                <w:szCs w:val="24"/>
-              </w:rPr>
-            </w:pPr>
-            <w:r>
-              <w:rPr>
-                <w:rFonts w:ascii="Times New Roman" w:eastAsia="Times New Roman" w:hAnsi="Times New Roman"/>
-                <w:sz w:val="24"/>
-                <w:szCs w:val="24"/>
-              </w:rPr>
-              <w:t>&lt;&lt;faRecipientTitle&gt;&gt;</w:t>
-            </w:r>
-          </w:p>
-          <w:p>
-            <w:pPr>
-              <w:widowControl w:val="0"/>
-              <w:autoSpaceDE w:val="0"/>
-              <w:autoSpaceDN w:val="0"/>
-              <w:adjustRightInd w:val="0"/>
-              <w:rPr>
-                <w:rFonts w:ascii="Times New Roman" w:eastAsia="Times New Roman" w:hAnsi="Times New Roman"/>
-                <w:sz w:val="24"/>
-                <w:szCs w:val="24"/>
-              </w:rPr>
-            </w:pPr>
-            <w:r>
-              <w:rPr>
-                <w:rFonts w:ascii="Times New Roman" w:eastAsia="Times New Roman" w:hAnsi="Times New Roman"/>
-                <w:sz w:val="24"/>
-                <w:szCs w:val="24"/>
-              </w:rPr>
-              <w:t>&lt;&lt;faOrgName&gt;&gt;</w:t>
-            </w:r>
-          </w:p>
-          <w:p>
-            <w:pPr>
-              <w:widowControl w:val="0"/>
-              <w:autoSpaceDE w:val="0"/>
-              <w:autoSpaceDN w:val="0"/>
-              <w:adjustRightInd w:val="0"/>
-              <w:rPr>
-                <w:rFonts w:ascii="Times New Roman" w:eastAsia="Times New Roman" w:hAnsi="Times New Roman"/>
-                <w:sz w:val="24"/>
-                <w:szCs w:val="24"/>
-              </w:rPr>
-            </w:pPr>
-            <w:r>
-              <w:rPr>
-                <w:rFonts w:ascii="Times New Roman" w:eastAsia="Times New Roman" w:hAnsi="Times New Roman"/>
-                <w:sz w:val="24"/>
-                <w:szCs w:val="24"/>
-              </w:rPr>
-              <w:t>&lt;&lt;faWorkAddr&gt;&gt;</w:t>
-            </w:r>
-          </w:p>
-          <w:p>
-            <w:pPr>
-              <w:widowControl w:val="0"/>
-              <w:autoSpaceDE w:val="0"/>
-              <w:autoSpaceDN w:val="0"/>
-              <w:adjustRightInd w:val="0"/>
-              <w:jc w:val="both"/>
-              <w:rPr>
-                <w:rFonts w:ascii="Times New Roman" w:eastAsia="Times New Roman" w:hAnsi="Times New Roman"/>
-                <w:sz w:val="24"/>
-                <w:szCs w:val="24"/>
-              </w:rPr>
-            </w:pPr>
-          </w:p>
-        </w:tc>
-        <w:tc>
-          <w:tcPr>
-            <w:tcW w:w="5580" w:type="dxa"/>
-          </w:tcPr>
-          <w:p>
-            <w:pPr>
-              <w:widowControl w:val="0"/>
-              <w:autoSpaceDE w:val="0"/>
-              <w:autoSpaceDN w:val="0"/>
-              <w:adjustRightInd w:val="0"/>
-              <w:rPr>
-                <w:rFonts w:ascii="Times New Roman" w:eastAsia="Times New Roman" w:hAnsi="Times New Roman"/>
-                <w:sz w:val="24"/>
-                <w:szCs w:val="24"/>
-              </w:rPr>
-            </w:pPr>
-          </w:p>
-        </w:tc>
-      </w:tr>
-    </w:tbl>
+          <w:bCs/>
+        </w:rPr>
+        <w:t xml:space="preserve"> </w:t>
+      </w:r>
+      <w:r>
+        <w:t xml:space="preserve">/ SLW Ref: </w:t>
+      </w:r>
+      <w:r>
+        <w:t xml:space="preserve">&lt;&lt;matterNo&gt;&gt; </w:t>
+      </w:r>
+      <w:r>
+        <w:t>/ Instructions to Pay</w:t>
+      </w:r>
+    </w:p>
+    <w:p>
+      <w:pPr>
+        <w:pStyle w:val="NormalWeb"/>
+        <w:spacing w:before="0" w:beforeAutospacing="0" w:after="0" w:afterAutospacing="0"/>
+      </w:pPr>
+    </w:p>
+    <w:p>
+      <w:pPr>
+        <w:pStyle w:val="NormalWeb"/>
+        <w:spacing w:before="0" w:beforeAutospacing="0" w:after="0" w:afterAutospacing="0"/>
+      </w:pPr>
+    </w:p>
+    <w:p>
+      <w:pPr>
+        <w:pStyle w:val="NormalWeb"/>
+        <w:spacing w:before="0" w:beforeAutospacing="0" w:after="0" w:afterAutospacing="0"/>
+      </w:pPr>
+    </w:p>
+    <w:p>
+      <w:pPr>
+        <w:pStyle w:val="NormalWeb"/>
+        <w:spacing w:before="0" w:beforeAutospacing="0" w:after="0" w:afterAutospacing="0"/>
+      </w:pPr>
+      <w:r>
+        <w:t>Body:</w:t>
+      </w:r>
+    </w:p>
+    <w:p>
+      <w:pPr>
+        <w:pStyle w:val="NormalWeb"/>
+        <w:spacing w:before="0" w:beforeAutospacing="0" w:after="0" w:afterAutospacing="0"/>
+      </w:pPr>
+    </w:p>
+    <w:p>
+      <w:pPr>
+        <w:pStyle w:val="NormalWeb"/>
+      </w:pPr>
+      <w:r>
+        <w:t xml:space="preserve">SCHWEGMAN LUNDBERG &amp; WOESSNER, P.A. </w:t>
+      </w:r>
+    </w:p>
+    <w:p>
+      <w:pPr>
+        <w:pStyle w:val="NormalWeb"/>
+      </w:pPr>
+    </w:p>
+    <w:p>
+      <w:r>
+        <w:t>&lt;&lt;This.WAName&gt;&gt; &lt;&lt;This.WAPhone&gt;</w:t>
+      </w:r>
+      <w:proofErr w:type="gramStart"/>
+      <w:r>
+        <w:t>&gt;  &lt;&lt;This.WAEmail</w:t>
+      </w:r>
+      <w:proofErr w:type="gramEnd"/>
+      <w:r>
+        <w:t>&gt;&gt;</w:t>
+      </w:r>
+    </w:p>
+    <w:p>
+      <w:r>
+        <w:t>&lt;&lt;This.paraName&gt;&gt; &lt;&lt;This.paraPhone&gt;</w:t>
+      </w:r>
+      <w:proofErr w:type="gramStart"/>
+      <w:r>
+        <w:t>&gt;  &lt;&lt;This.paraEmail</w:t>
+      </w:r>
+      <w:proofErr w:type="gramEnd"/>
+      <w:r>
+        <w:t>&gt;&gt;</w:t>
+      </w:r>
+    </w:p>
     <w:p>
       <w:pPr>
         <w:widowControl w:val="0"/>
@@ -791,7 +635,25 @@
           <w:sz w:val="24"/>
           <w:szCs w:val="24"/>
         </w:rPr>
-        <w:t xml:space="preserve"> annuities.  Thus, it is not necessary for annual reminders regarding annuities.  If you receive information from the patent office that an annuity has NOT been timely paid, we ask that you contact us immediately so that we can look into the matter.  If there is a grace period in your country and you have not received instructions, do not automatically pay the annuity, contact us first.  If your country’s patent office does not issue notices of this type, we do not expect your firm to search the patent office records without specific instructions from our firm.</w:t>
+        <w:t xml:space="preserve"> annuities.  Thus, it is not necessary for annual reminders regarding annuities.  If you receive information from the patent office that an annuity has NOT been timely paid, we ask that you contact us immediately so that we can </w:t>
+      </w:r>
+      <w:proofErr w:type="gramStart"/>
+      <w:r>
+        <w:rPr>
+          <w:rFonts w:ascii="Times New Roman" w:hAnsi="Times New Roman"/>
+          <w:sz w:val="24"/>
+          <w:szCs w:val="24"/>
+        </w:rPr>
+        <w:t>look into</w:t>
+      </w:r>
+      <w:proofErr w:type="gramEnd"/>
+      <w:r>
+        <w:rPr>
+          <w:rFonts w:ascii="Times New Roman" w:hAnsi="Times New Roman"/>
+          <w:sz w:val="24"/>
+          <w:szCs w:val="24"/>
+        </w:rPr>
+        <w:t xml:space="preserve"> the matter.  If there is a grace period in your country and you have not received instructions, do not automatically pay the annuity, contact us first.  If your country’s patent office does not issue notices of this type, we do not expect your firm to search the patent office records without specific instructions from our firm.</w:t>
       </w:r>
     </w:p>
     <w:p>
@@ -897,8 +759,23 @@
           <w:sz w:val="24"/>
           <w:szCs w:val="24"/>
         </w:rPr>
+        <w:lastRenderedPageBreak/>
         <w:t>Paralegal -- International Department</w:t>
       </w:r>
+    </w:p>
+    <w:p>
+      <w:pPr>
+        <w:widowControl w:val="0"/>
+        <w:autoSpaceDE w:val="0"/>
+        <w:autoSpaceDN w:val="0"/>
+        <w:adjustRightInd w:val="0"/>
+        <w:jc w:val="both"/>
+        <w:rPr>
+          <w:rFonts w:ascii="Times New Roman" w:eastAsia="Times New Roman" w:hAnsi="Times New Roman"/>
+          <w:sz w:val="24"/>
+          <w:szCs w:val="24"/>
+        </w:rPr>
+      </w:pPr>
     </w:p>
     <w:sectPr>
       <w:pgSz w:w="12240" w:h="15840"/>
@@ -1349,7 +1226,6 @@
   <w:style w:type="character" w:default="1" w:styleId="DefaultParagraphFont">
     <w:name w:val="Default Paragraph Font"/>
     <w:uiPriority w:val="1"/>
-    <w:semiHidden/>
     <w:unhideWhenUsed/>
   </w:style>
   <w:style w:type="table" w:default="1" w:styleId="TableNormal">
@@ -1419,6 +1295,19 @@
     <w:rPr>
       <w:sz w:val="22"/>
       <w:szCs w:val="22"/>
+    </w:rPr>
+  </w:style>
+  <w:style w:type="paragraph" w:styleId="NormalWeb">
+    <w:name w:val="Normal (Web)"/>
+    <w:basedOn w:val="Normal"/>
+    <w:uiPriority w:val="99"/>
+    <w:unhideWhenUsed/>
+    <w:rsid w:val="00040C2B"/>
+    <w:pPr>
+      <w:spacing w:before="100" w:beforeAutospacing="1" w:after="100" w:afterAutospacing="1"/>
+    </w:pPr>
+    <w:rPr>
+      <w:rFonts w:eastAsiaTheme="minorHAnsi" w:cs="Calibri"/>
     </w:rPr>
   </w:style>
 </w:styles>

</xml_diff>